<commit_message>
remove copy and update week 5 document
</commit_message>
<xml_diff>
--- a/Weekly Reports/CS 442 Weekly Report for Week 5.docx
+++ b/Weekly Reports/CS 442 Weekly Report for Week 5.docx
@@ -51,7 +51,37 @@
           <w:szCs w:val="22"/>
           <w:u w:val="single"/>
         </w:rPr>
-        <w:t xml:space="preserve"> Group X for Week Y</w:t>
+        <w:t xml:space="preserve"> Group </w:t>
+      </w:r>
+      <w:r>
+        <w:rPr>
+          <w:b/>
+          <w:bCs/>
+          <w:sz w:val="28"/>
+          <w:szCs w:val="22"/>
+          <w:u w:val="single"/>
+        </w:rPr>
+        <w:t>12</w:t>
+      </w:r>
+      <w:r>
+        <w:rPr>
+          <w:b/>
+          <w:bCs/>
+          <w:sz w:val="28"/>
+          <w:szCs w:val="22"/>
+          <w:u w:val="single"/>
+        </w:rPr>
+        <w:t xml:space="preserve"> for Week </w:t>
+      </w:r>
+      <w:r>
+        <w:rPr>
+          <w:b/>
+          <w:bCs/>
+          <w:sz w:val="28"/>
+          <w:szCs w:val="22"/>
+          <w:u w:val="single"/>
+        </w:rPr>
+        <w:t>5</w:t>
       </w:r>
     </w:p>
     <w:p>

</xml_diff>